<commit_message>
docs(phase1): complete Benjamin Fix and Go evidence
</commit_message>
<xml_diff>
--- a/APT122_005D/Equipo_Por_Definir/Fase_1/Evidencias_Individuales/Olmedo_Benjamin/Olmedo_Benjamin_1.3_APT122_AutoevaluacionFase1.docx
+++ b/APT122_005D/Equipo_Por_Definir/Fase_1/Evidencias_Individuales/Olmedo_Benjamin/Olmedo_Benjamin_1.3_APT122_AutoevaluacionFase1.docx
@@ -49,7 +49,7 @@
           <w:color w:val="172033"/>
           <w:sz w:val="36"/>
         </w:rPr>
-        <w:t>RUAHTONE</w:t>
+        <w:t>FIX &amp; GO</w:t>
       </w:r>
     </w:p>
     <w:tbl>
@@ -242,7 +242,7 @@
                 <w:color w:val="172033"/>
                 <w:sz w:val="20"/>
               </w:rPr>
-              <w:t>Benjamín Olmedo · Daniel Baeza · Felipe Arce</w:t>
+              <w:t>Benjamín Olmedo · Daniel Baeza · Felipe Arce · Equipo por definir</w:t>
             </w:r>
           </w:p>
         </w:tc>
@@ -299,7 +299,7 @@
                 <w:color w:val="172033"/>
                 <w:sz w:val="20"/>
               </w:rPr>
-              <w:t>PTY4614 · Capstone</w:t>
+              <w:t>APT122 · Proyecto APT</w:t>
             </w:r>
           </w:p>
         </w:tc>
@@ -413,7 +413,7 @@
                 <w:color w:val="172033"/>
                 <w:sz w:val="20"/>
               </w:rPr>
-              <w:t>RUAHTONE</w:t>
+              <w:t>Fix &amp; Go</w:t>
             </w:r>
           </w:p>
         </w:tc>
@@ -470,7 +470,7 @@
                 <w:color w:val="172033"/>
                 <w:sz w:val="20"/>
               </w:rPr>
-              <w:t>12 de agosto de 2026</w:t>
+              <w:t>1 de septiembre de 2026</w:t>
             </w:r>
           </w:p>
         </w:tc>
@@ -516,7 +516,7 @@
           <w:color w:val="172033"/>
           <w:sz w:val="22"/>
         </w:rPr>
-        <w:t>RUAHTONE es una propuesta de aplicación web y, en su proyección, móvil para organizar servicios y eventos de iglesias cristianas. Surge ante la fragmentación de horarios, confirmaciones, repertorios, tonalidades, letras, prédicas y recursos multimedia entre WhatsApp, llamadas y archivos dispersos. La solución centraliza cada servicio y relaciona personas, ministerios, funciones, canciones, recursos, tareas y actividad, mediante permisos escalables para servidores, líderes y administradores. Durante la asignatura se construirá un MVP frontend local, responsive y persistente en el navegador, sin backend, pagos, autenticación real ni integración con WhatsApp. La metodología será incremental, con requisitos versionados, arquitectura por capas, control de versiones, pruebas y validación con usuarios de iglesias en Chile. La evidencia permitirá evaluar si las personas encuentran y actualizan la información crítica con mayor claridad que en el proceso actual.</w:t>
+        <w:t>Fix &amp; Go es una propuesta de aplicación móvil que conecta a personas que necesitan resolver trabajos cotidianos con profesionales disponibles en zonas cercanas. El proyecto responde a un proceso de contratación fragmentado entre recomendaciones, redes sociales, publicaciones aisladas y contactos sin información comparable sobre especialidad, cobertura, disponibilidad o reputación. El MVP permitirá seleccionar una categoría, buscar profesionales por ubicación, revisar perfiles, crear una solicitud, aceptar o rechazar el trabajo, consultar su estado y registrar una valoración. La primera versión académica utilizará datos de demostración y un flujo controlado; pagos integrados, chat en tiempo real, verificación documental y geolocalización productiva quedarán fuera del alcance inicial. El trabajo se desarrollará de forma incremental, con requisitos versionados, prototipos, control de versiones, pruebas y validación con usuarios potenciales. La evidencia permitirá evaluar si el flujo facilita encontrar y solicitar ayuda profesional de manera más clara, rápida y confiable.</w:t>
       </w:r>
     </w:p>
     <w:p>
@@ -528,17 +528,7 @@
           <w:color w:val="172033"/>
           <w:sz w:val="22"/>
         </w:rPr>
-        <w:t xml:space="preserve">Palabras clave: </w:t>
-      </w:r>
-      <w:r>
-        <w:rPr>
-          <w:rFonts w:ascii="Calibri" w:hAnsi="Calibri"/>
-          <w:b w:val="0"/>
-          <w:i/>
-          <w:color w:val="172033"/>
-          <w:sz w:val="22"/>
-        </w:rPr>
-        <w:t>gestión de eventos, iglesias, coordinación de equipos, software, experiencia de usuario.</w:t>
+        <w:t>Palabras clave: servicios locales, profesionales, aplicación móvil, geolocalización, marketplace, experiencia de usuario.</w:t>
       </w:r>
     </w:p>
     <w:p>
@@ -561,7 +551,7 @@
           <w:color w:val="172033"/>
           <w:sz w:val="22"/>
         </w:rPr>
-        <w:t>RUAHTONE is a web-based and, in its long-term vision, mobile application for organizing services and events in Christian churches. The project responds to fragmented schedules, attendance confirmations, song sets, key changes, lyrics, sermon files, and multimedia resources distributed across WhatsApp, phone calls, and isolated documents. The solution places each service at the center and connects people, ministries, assignments, songs, resources, checklists, and structured activity through scalable permissions for volunteers, leaders, and administrators. During the course, the team will build a responsive local frontend MVP with browser persistence, excluding backend services, real authentication, payments, and WhatsApp integration. The project will follow an incremental method supported by versioned requirements, layered architecture, source control, testing, and validation with church users in Chile. The collected evidence will determine whether users can find and update critical information more clearly than in the current process.</w:t>
+        <w:t>Fix &amp; Go is a mobile application proposal that connects people who need everyday services with professionals available in nearby areas. The project addresses a fragmented hiring process based on personal referrals, social media posts, isolated listings, and contacts with little comparable information about expertise, coverage, availability, or reputation. The MVP will allow users to select a category, search by location, review professional profiles, create a service request, accept or reject a job, track its basic status, and submit a rating. The academic version will use demo data and a controlled end-to-end flow; integrated payments, real-time chat, document verification, and production-grade geolocation will remain outside the initial scope. The team will work incrementally through versioned requirements, prototypes, source control, testing, and validation with potential users. The collected evidence will determine whether the proposed flow makes local professional services easier, faster, and more trustworthy to request.</w:t>
       </w:r>
     </w:p>
     <w:p>
@@ -573,17 +563,7 @@
           <w:color w:val="172033"/>
           <w:sz w:val="22"/>
         </w:rPr>
-        <w:t xml:space="preserve">Keywords: </w:t>
-      </w:r>
-      <w:r>
-        <w:rPr>
-          <w:rFonts w:ascii="Calibri" w:hAnsi="Calibri"/>
-          <w:b w:val="0"/>
-          <w:i/>
-          <w:color w:val="172033"/>
-          <w:sz w:val="22"/>
-        </w:rPr>
-        <w:t>event management, churches, team coordination, software, user experience.</w:t>
+        <w:t>Keywords: local services, professionals, mobile application, geolocation, marketplace, user experience.</w:t>
       </w:r>
     </w:p>
     <w:p>
@@ -606,7 +586,7 @@
           <w:color w:val="172033"/>
           <w:sz w:val="22"/>
         </w:rPr>
-        <w:t>RUAHTONE propone centralizar la planificación de cultos dominicales, reuniones de jóvenes, ensayos, reuniones de planificación y otros eventos. Actualmente, muchas iglesias coordinan por WhatsApp y llamadas; esto provoca información cruzada, contenidos que llegan tarde, cambios de tonalidad difíciles de seguir y poca claridad sobre horarios, lugares, funciones y confirmaciones. El producto organiza cada evento como un centro operacional con equipos de sonido, multimedia, adoración y pastorado, además de funciones específicas por área.</w:t>
+        <w:t>Fix &amp; Go propone centralizar la búsqueda y contratación inicial de profesionales para trabajos cercanos, como reparaciones, mantenciones o servicios técnicos. Actualmente, muchas personas dependen de recomendaciones informales o publicaciones dispersas, lo que dificulta comparar perfiles, conocer la zona de cobertura, confirmar disponibilidad y mantener trazabilidad sobre una solicitud.</w:t>
       </w:r>
     </w:p>
     <w:p>
@@ -621,7 +601,7 @@
           <w:color w:val="172033"/>
           <w:sz w:val="22"/>
         </w:rPr>
-        <w:t>El sistema considera tres niveles organizacionales acumulativos: el servidor opera únicamente sus responsabilidades; el líder conserva las capacidades de servidor y coordina su área; y el administrador conserva capacidades de liderazgo y gobierna la organización. La visión comercial futura contempla suscripciones escalables y soporte para múltiples sedes en el plan superior, pero estos elementos no forman parte del MVP académico.</w:t>
+        <w:t>La solución considera tres actores principales: el cliente crea y consulta solicitudes; el profesional configura su perfil, categorías y cobertura, y responde a oportunidades; y un rol administrativo supervisa categorías y reportes básicos. El flujo central parte con la necesidad del cliente y termina con una solicitud aceptada, seguimiento de estado y valoración.</w:t>
       </w:r>
     </w:p>
     <w:p>
@@ -636,7 +616,7 @@
           <w:color w:val="172033"/>
           <w:sz w:val="22"/>
         </w:rPr>
-        <w:t>La propuesta es relevante para el campo laboral de la informática porque integra descubrimiento de producto, análisis de requisitos, arquitectura, modelado de datos, interfaces responsive, accesibilidad, persistencia, control de versiones y pruebas. También aborda una oportunidad concreta: desarrollar software vertical para organizaciones que todavía dependen de procesos manuales y canales no diseñados para gestión operacional (RUAHTONE, 2026a, 2026b).</w:t>
+        <w:t>La propuesta es relevante para la informática porque integra análisis de requerimientos, experiencia móvil, arquitectura, modelado de datos, seguridad y privacidad, desarrollo de interfaces, integración, control de versiones y pruebas. Además, permite aplicar gestión de proyectos e innovación a un producto digital con posibilidad de evolución comercial (Duoc UC, s.f.).</w:t>
       </w:r>
     </w:p>
     <w:tbl>
@@ -693,7 +673,7 @@
                 <w:color w:val="172033"/>
                 <w:sz w:val="21"/>
               </w:rPr>
-              <w:t>El proyecto de la asignatura es un MVP frontend local que valida el núcleo de organización. Las aplicaciones nativas, el SaaS multiiglesia, las suscripciones, las notificaciones reales y WhatsApp quedan como evolución posterior.</w:t>
+              <w:t>El alcance evaluable es un MVP móvil del flujo buscar → revisar perfil → solicitar → responder → seguir estado. Pagos, chat en tiempo real, verificación documental, geolocalización productiva y operación comercial quedan como evolución posterior.</w:t>
             </w:r>
           </w:p>
         </w:tc>
@@ -825,7 +805,7 @@
                 <w:color w:val="FFFFFF"/>
                 <w:sz w:val="18"/>
               </w:rPr>
-              <w:t>Aplicación en RUAHTONE</w:t>
+              <w:t>Aplicación en Fix &amp; Go</w:t>
             </w:r>
           </w:p>
         </w:tc>
@@ -911,7 +891,7 @@
                 <w:color w:val="172033"/>
                 <w:sz w:val="18"/>
               </w:rPr>
-              <w:t>Diseñar pruebas de validación y convertir sus resultados en mejoras priorizadas para el MVP.</w:t>
+              <w:t>Diseñar pruebas del flujo de búsqueda, solicitud y respuesta, y convertir los hallazgos en mejoras priorizadas.</w:t>
             </w:r>
           </w:p>
         </w:tc>
@@ -1000,7 +980,7 @@
                 <w:color w:val="172033"/>
                 <w:sz w:val="18"/>
               </w:rPr>
-              <w:t>Planificar alcance, actividades, recursos, responsables, riesgos e hitos; controlar el avance con evidencia versionada.</w:t>
+              <w:t>Planificar alcance, responsables, recursos, riesgos e hitos; controlar el avance con evidencia versionada.</w:t>
             </w:r>
           </w:p>
         </w:tc>
@@ -1086,7 +1066,7 @@
                 <w:color w:val="172033"/>
                 <w:sz w:val="18"/>
               </w:rPr>
-              <w:t>Diseñar e implementar entidades y relaciones que soporten varias iglesias en el futuro sin mezclar la información de cada organización.</w:t>
+              <w:t>Diseñar entidades y relaciones para clientes, profesionales, categorías, cobertura, solicitudes, estados y valoraciones.</w:t>
             </w:r>
           </w:p>
         </w:tc>
@@ -1175,7 +1155,7 @@
                 <w:color w:val="172033"/>
                 <w:sz w:val="18"/>
               </w:rPr>
-              <w:t>Construir, integrar y desplegar una solución frontend coherente con técnicas sistemáticas de desarrollo y mantenimiento.</w:t>
+              <w:t>Construir e integrar una experiencia móvil coherente mediante técnicas sistemáticas de desarrollo y mantenimiento.</w:t>
             </w:r>
           </w:p>
         </w:tc>
@@ -1206,7 +1186,7 @@
           <w:color w:val="172033"/>
           <w:sz w:val="22"/>
         </w:rPr>
-        <w:t>Mis intereses profesionales se concentran en el desarrollo de productos digitales útiles, la arquitectura de software y la mejora de procesos mediante tecnología. Además, mi experiencia sirviendo en sonido y adoración me permite reconocer el problema desde la operación real de una iglesia. RUAHTONE integra esos intereses porque exige convertir una necesidad observada en un producto organizado, usable, escalable y verificable.</w:t>
+        <w:t>Mis intereses profesionales se concentran en el desarrollo de software, la creación de productos digitales y la dirección de proyectos tecnológicos. Me interesa iniciar participando directamente en la construcción de una solución y, con el crecimiento del producto, asumir la estrategia, la coordinación y el liderazgo de un equipo. Fix &amp; Go conecta esos intereses porque exige transformar una necesidad cotidiana en una experiencia móvil clara, verificable y con potencial de negocio.</w:t>
       </w:r>
     </w:p>
     <w:p>
@@ -1221,7 +1201,7 @@
           <w:color w:val="172033"/>
           <w:sz w:val="22"/>
         </w:rPr>
-        <w:t>Mi aporte individual: Aporto principalmente la visión de sonido y adoración, el levantamiento de reglas operacionales, la coherencia del modelo de dominio y la coordinación de la documentación del producto.</w:t>
+        <w:t>Mi aporte individual: Lideraré principalmente el frontend móvil, el prototipado y la consistencia de la experiencia de usuario. También aportaré creatividad, organización del trabajo, comunicación en inglés técnico y coordinación de decisiones. La asignación definitiva de backend, datos y calidad se acordará con Daniel Baeza y Felipe Arce según las fortalezas de cada integrante.</w:t>
       </w:r>
     </w:p>
     <w:p>
@@ -1244,7 +1224,7 @@
           <w:color w:val="172033"/>
           <w:sz w:val="22"/>
         </w:rPr>
-        <w:t>El proyecto es factible si se mantiene el alcance acordado. El equipo dispone de tres estudiantes con experiencia en iglesias distintas, acceso a usuarios representativos y un repositorio GitHub para colaborar. El MVP utiliza tecnologías web gratuitas y datos ficticios, por lo que no requiere infraestructura pagada ni tratamiento de información sensible. El trabajo se divide en incrementos verticales que producen resultados demostrables durante el semestre (RUAHTONE, 2026e).</w:t>
+        <w:t>Fix &amp; Go es factible si el equipo limita la primera entrega al flujo esencial de descubrimiento y solicitud. Los tres integrantes cuentan con computadores, acceso a GitHub y experiencia académica en desarrollo de software y trabajo colaborativo. El MVP podrá utilizar herramientas gratuitas y datos ficticios, evitando pagos reales y almacenamiento de documentos sensibles. La construcción incremental permitirá validar primero el problema, después la experiencia móvil y finalmente la integración del flujo completo.</w:t>
       </w:r>
     </w:p>
     <w:tbl>
@@ -1436,7 +1416,7 @@
                 <w:color w:val="172033"/>
                 <w:sz w:val="18"/>
               </w:rPr>
-              <w:t>Tres computadores, conexión a internet para GitHub, navegadores y herramientas de desarrollo gratuitas.</w:t>
+              <w:t>Tres computadores, GitHub, herramientas gratuitas de diseño y desarrollo móvil, y datos de demostración.</w:t>
             </w:r>
           </w:p>
         </w:tc>
@@ -1495,7 +1475,7 @@
                 <w:color w:val="172033"/>
                 <w:sz w:val="18"/>
               </w:rPr>
-              <w:t>Disponibilidad de voluntarios para validación y retroalimentación del docente.</w:t>
+              <w:t>Disponibilidad de clientes y profesionales independientes para entrevistas y validación.</w:t>
             </w:r>
           </w:p>
         </w:tc>
@@ -1556,7 +1536,7 @@
                 <w:color w:val="172033"/>
                 <w:sz w:val="18"/>
               </w:rPr>
-              <w:t>Congelar backend, pagos, aplicaciones nativas, WhatsApp y multi-sede durante el MVP.</w:t>
+              <w:t>Excluir pagos, chat en tiempo real, verificación documental y operación comercial durante el MVP.</w:t>
             </w:r>
           </w:p>
         </w:tc>
@@ -1588,7 +1568,7 @@
                 <w:color w:val="172033"/>
                 <w:sz w:val="18"/>
               </w:rPr>
-              <w:t>Riesgo técnico</w:t>
+              <w:t>Riesgo técnico y privacidad</w:t>
             </w:r>
           </w:p>
         </w:tc>
@@ -1615,7 +1595,7 @@
                 <w:color w:val="172033"/>
                 <w:sz w:val="18"/>
               </w:rPr>
-              <w:t>Arquitectura por capas, datos demo versionados, revisión por pares y pruebas tempranas.</w:t>
+              <w:t>Prototipo temprano, permisos mínimos, datos ficticios, revisión por pares y pruebas incrementales.</w:t>
             </w:r>
           </w:p>
         </w:tc>
@@ -1676,7 +1656,7 @@
                 <w:color w:val="172033"/>
                 <w:sz w:val="18"/>
               </w:rPr>
-              <w:t>Ramas, pull requests pequeños, responsables visibles y reuniones breves de seguimiento.</w:t>
+              <w:t>Definir responsabilidades, mantener backlog visible, usar ramas y revisar cambios antes de integrarlos.</w:t>
             </w:r>
           </w:p>
         </w:tc>
@@ -1707,17 +1687,7 @@
           <w:color w:val="1F4D78"/>
           <w:sz w:val="22"/>
         </w:rPr>
-        <w:t xml:space="preserve">Objetivo general. </w:t>
-      </w:r>
-      <w:r>
-        <w:rPr>
-          <w:rFonts w:ascii="Calibri" w:hAnsi="Calibri"/>
-          <w:b w:val="0"/>
-          <w:i w:val="0"/>
-          <w:color w:val="172033"/>
-          <w:sz w:val="22"/>
-        </w:rPr>
-        <w:t>Diseñar, construir y validar durante la asignatura un MVP frontend local de RUAHTONE que centralice la preparación de servicios de iglesias cristianas, permitiendo gestionar eventos, equipos, asignaciones, confirmaciones, repertorio, recursos y tareas desde una experiencia diferenciada por rol.</w:t>
+        <w:t>Objetivo general. Diseñar, construir y validar durante APT122 un MVP móvil de Fix &amp; Go que permita descubrir profesionales cercanos, revisar sus perfiles y gestionar una solicitud de servicio mediante una experiencia simple, coherente y trazable.</w:t>
       </w:r>
     </w:p>
     <w:p>
@@ -1732,17 +1702,7 @@
           <w:color w:val="1F4D78"/>
           <w:sz w:val="22"/>
         </w:rPr>
-        <w:t xml:space="preserve">Objetivo específico 1. </w:t>
-      </w:r>
-      <w:r>
-        <w:rPr>
-          <w:rFonts w:ascii="Calibri" w:hAnsi="Calibri"/>
-          <w:b w:val="0"/>
-          <w:i w:val="0"/>
-          <w:color w:val="172033"/>
-          <w:sz w:val="22"/>
-        </w:rPr>
-        <w:t>Levantar y formalizar requisitos, reglas de negocio, roles, flujos y criterios de aceptación a partir de la experiencia del equipo y de validaciones con servidores de iglesias en Chile.</w:t>
+        <w:t>Objetivo específico 1. Levantar y formalizar las necesidades de clientes y profesionales, definiendo actores, reglas, estados, riesgos y criterios de aceptación para el flujo principal.</w:t>
       </w:r>
     </w:p>
     <w:p>
@@ -1757,17 +1717,7 @@
           <w:color w:val="1F4D78"/>
           <w:sz w:val="22"/>
         </w:rPr>
-        <w:t xml:space="preserve">Objetivo específico 2. </w:t>
-      </w:r>
-      <w:r>
-        <w:rPr>
-          <w:rFonts w:ascii="Calibri" w:hAnsi="Calibri"/>
-          <w:b w:val="0"/>
-          <w:i w:val="0"/>
-          <w:color w:val="172033"/>
-          <w:sz w:val="22"/>
-        </w:rPr>
-        <w:t>Modelar una arquitectura y un conjunto de datos coherentes que separen personas, ministerios, servicios, asignaciones, canciones contextuales, recursos, checklists y actividad.</w:t>
+        <w:t>Objetivo específico 2. Modelar una arquitectura y un conjunto de datos escalables para usuarios, perfiles profesionales, categorías, zonas de cobertura, solicitudes, estados y valoraciones.</w:t>
       </w:r>
     </w:p>
     <w:p>
@@ -1782,17 +1732,7 @@
           <w:color w:val="1F4D78"/>
           <w:sz w:val="22"/>
         </w:rPr>
-        <w:t xml:space="preserve">Objetivo específico 3. </w:t>
-      </w:r>
-      <w:r>
-        <w:rPr>
-          <w:rFonts w:ascii="Calibri" w:hAnsi="Calibri"/>
-          <w:b w:val="0"/>
-          <w:i w:val="0"/>
-          <w:color w:val="172033"/>
-          <w:sz w:val="22"/>
-        </w:rPr>
-        <w:t>Implementar un flujo vertical responsive y accesible para consultar el próximo servicio, confirmar asistencia, gestionar repertorio y recursos, completar tareas y observar la trazabilidad de los cambios.</w:t>
+        <w:t>Objetivo específico 3. Implementar una experiencia móvil accesible para buscar por categoría y cercanía, consultar perfiles, crear una solicitud, responderla y observar su estado.</w:t>
       </w:r>
     </w:p>
     <w:p>
@@ -1807,17 +1747,7 @@
           <w:color w:val="1F4D78"/>
           <w:sz w:val="22"/>
         </w:rPr>
-        <w:t xml:space="preserve">Objetivo específico 4. </w:t>
-      </w:r>
-      <w:r>
-        <w:rPr>
-          <w:rFonts w:ascii="Calibri" w:hAnsi="Calibri"/>
-          <w:b w:val="0"/>
-          <w:i w:val="0"/>
-          <w:color w:val="172033"/>
-          <w:sz w:val="22"/>
-        </w:rPr>
-        <w:t>Evaluar el producto mediante pruebas automatizadas, recorridos funcionales y sesiones moderadas con usuarios representativos, utilizando los hallazgos para priorizar mejoras.</w:t>
+        <w:t>Objetivo específico 4. Evaluar el MVP mediante pruebas funcionales, revisión de interfaz y sesiones con usuarios potenciales, utilizando los hallazgos para priorizar mejoras.</w:t>
       </w:r>
     </w:p>
     <w:p>
@@ -1840,7 +1770,7 @@
           <w:color w:val="172033"/>
           <w:sz w:val="22"/>
         </w:rPr>
-        <w:t>Se utilizará una metodología incremental y colaborativa, adecuada a un producto digital en fase de descubrimiento. Cada ciclo comenzará con un problema y criterios de aceptación, continuará con diseño e implementación, y terminará con verificación, evidencia y ajuste.</w:t>
+        <w:t>Se utilizará una metodología incremental y colaborativa, apoyada en prácticas de Scrum adaptadas al contexto académico. Cada ciclo comenzará con un objetivo y criterios de aceptación, continuará con diseño e implementación, y terminará con verificación, evidencia y ajuste (Schwaber &amp; Sutherland, 2020).</w:t>
       </w:r>
     </w:p>
     <w:p>
@@ -1855,7 +1785,7 @@
           <w:color w:val="172033"/>
           <w:sz w:val="22"/>
         </w:rPr>
-        <w:t>Descubrir y validar necesidades mediante entrevistas breves y observación de procesos en las iglesias del equipo.</w:t>
+        <w:t>Descubrir y validar necesidades mediante entrevistas breves a personas que contratan servicios y a profesionales independientes.</w:t>
       </w:r>
     </w:p>
     <w:p>
@@ -1870,7 +1800,7 @@
           <w:color w:val="172033"/>
           <w:sz w:val="22"/>
         </w:rPr>
-        <w:t>Especificar historias, requisitos, reglas de negocio, flujos, riesgos y criterios de aceptación en documentos versionados.</w:t>
+        <w:t>Especificar historias de usuario, reglas, estados, riesgos y criterios de aceptación en documentación versionada.</w:t>
       </w:r>
     </w:p>
     <w:p>
@@ -1885,7 +1815,7 @@
           <w:color w:val="172033"/>
           <w:sz w:val="22"/>
         </w:rPr>
-        <w:t>Diseñar el modelo de datos, la arquitectura, la navegación y prototipos antes de implementar funcionalidades de alto riesgo.</w:t>
+        <w:t>Diseñar el modelo de datos, la arquitectura móvil, la navegación y el prototipo antes de integrar funcionalidades de mayor riesgo.</w:t>
       </w:r>
     </w:p>
     <w:p>
@@ -1900,7 +1830,7 @@
           <w:color w:val="172033"/>
           <w:sz w:val="22"/>
         </w:rPr>
-        <w:t>Construir incrementos verticales pequeños en ramas separadas, revisados mediante pull request antes de integrarlos a main.</w:t>
+        <w:t>Construir incrementos pequeños en ramas separadas, revisados mediante pull request antes de integrarlos a main.</w:t>
       </w:r>
     </w:p>
     <w:p>
@@ -1915,7 +1845,7 @@
           <w:color w:val="172033"/>
           <w:sz w:val="22"/>
         </w:rPr>
-        <w:t>Verificar dominio, componentes y flujos críticos; revisar accesibilidad, responsive, persistencia y consistencia de datos.</w:t>
+        <w:t>Verificar componentes y flujos críticos; revisar accesibilidad, adaptación a pantallas, consistencia de datos, privacidad y manejo de errores.</w:t>
       </w:r>
     </w:p>
     <w:p>
@@ -1930,7 +1860,7 @@
           <w:color w:val="172033"/>
           <w:sz w:val="22"/>
         </w:rPr>
-        <w:t>Validar con usuarios representativos, registrar tiempos, éxito, dudas y errores, y priorizar mejoras por impacto y frecuencia.</w:t>
+        <w:t>Validar con usuarios potenciales, registrar éxito, tiempos, dudas y errores, y priorizar mejoras por impacto y frecuencia.</w:t>
       </w:r>
     </w:p>
     <w:p>
@@ -2212,7 +2142,7 @@
                 <w:color w:val="172033"/>
                 <w:sz w:val="16"/>
               </w:rPr>
-              <w:t>Problema, alcance, requisitos y rúbrica</w:t>
+              <w:t>Problema, usuarios, alcance y criterios</w:t>
             </w:r>
           </w:p>
         </w:tc>
@@ -2266,7 +2196,7 @@
                 <w:color w:val="172033"/>
                 <w:sz w:val="16"/>
               </w:rPr>
-              <w:t>Experiencia en tres iglesias</w:t>
+              <w:t>Idea inicial y perfil de egreso</w:t>
             </w:r>
           </w:p>
         </w:tc>
@@ -2293,7 +2223,7 @@
                 <w:color w:val="172033"/>
                 <w:sz w:val="16"/>
               </w:rPr>
-              <w:t>Alcance excesivo o supuestos sin validar</w:t>
+              <w:t>Supuestos sin validar</w:t>
             </w:r>
           </w:p>
         </w:tc>
@@ -2326,7 +2256,7 @@
                 <w:color w:val="172033"/>
                 <w:sz w:val="16"/>
               </w:rPr>
-              <w:t>2. Diseño</w:t>
+              <w:t>2. Producto y UX</w:t>
             </w:r>
           </w:p>
         </w:tc>
@@ -2382,7 +2312,7 @@
                 <w:color w:val="172033"/>
                 <w:sz w:val="16"/>
               </w:rPr>
-              <w:t>Flujos, modelo, arquitectura y prototipo</w:t>
+              <w:t>Flujos, navegación y prototipo móvil</w:t>
             </w:r>
           </w:p>
         </w:tc>
@@ -2410,7 +2340,7 @@
                 <w:color w:val="172033"/>
                 <w:sz w:val="16"/>
               </w:rPr>
-              <w:t>Equipo completo</w:t>
+              <w:t>Benjamín lidera frontend; equipo valida</w:t>
             </w:r>
           </w:p>
         </w:tc>
@@ -2438,7 +2368,7 @@
                 <w:color w:val="172033"/>
                 <w:sz w:val="16"/>
               </w:rPr>
-              <w:t>Documentación aprobada</w:t>
+              <w:t>Referencias móviles y entrevistas</w:t>
             </w:r>
           </w:p>
         </w:tc>
@@ -2466,7 +2396,7 @@
                 <w:color w:val="172033"/>
                 <w:sz w:val="16"/>
               </w:rPr>
-              <w:t>Diferencias entre procesos de cada iglesia</w:t>
+              <w:t>Flujo demasiado amplio</w:t>
             </w:r>
           </w:p>
         </w:tc>
@@ -2498,7 +2428,7 @@
                 <w:color w:val="172033"/>
                 <w:sz w:val="16"/>
               </w:rPr>
-              <w:t>3. Fundaciones</w:t>
+              <w:t>3. Arquitectura y datos</w:t>
             </w:r>
           </w:p>
         </w:tc>
@@ -2552,7 +2482,7 @@
                 <w:color w:val="172033"/>
                 <w:sz w:val="16"/>
               </w:rPr>
-              <w:t>Proyecto ejecutable, datos demo y navegación</w:t>
+              <w:t>Stack, modelo, repositorios y datos demo</w:t>
             </w:r>
           </w:p>
         </w:tc>
@@ -2579,7 +2509,7 @@
                 <w:color w:val="172033"/>
                 <w:sz w:val="16"/>
               </w:rPr>
-              <w:t>Desarrollo compartido</w:t>
+              <w:t>Distribución técnica por acordar</w:t>
             </w:r>
           </w:p>
         </w:tc>
@@ -2606,7 +2536,7 @@
                 <w:color w:val="172033"/>
                 <w:sz w:val="16"/>
               </w:rPr>
-              <w:t>Stack conocido y repositorio Git</w:t>
+              <w:t>GitHub y documentación</w:t>
             </w:r>
           </w:p>
         </w:tc>
@@ -2633,7 +2563,7 @@
                 <w:color w:val="172033"/>
                 <w:sz w:val="16"/>
               </w:rPr>
-              <w:t>Curva de aprendizaje y coordinación técnica</w:t>
+              <w:t>Decisiones técnicas tardías</w:t>
             </w:r>
           </w:p>
         </w:tc>
@@ -2722,7 +2652,7 @@
                 <w:color w:val="172033"/>
                 <w:sz w:val="16"/>
               </w:rPr>
-              <w:t>Servicio, asignación, confirmación y actividad</w:t>
+              <w:t>Búsqueda, perfil, solicitud y respuesta</w:t>
             </w:r>
           </w:p>
         </w:tc>
@@ -2778,7 +2708,7 @@
                 <w:color w:val="172033"/>
                 <w:sz w:val="16"/>
               </w:rPr>
-              <w:t>Criterios de aceptación definidos</w:t>
+              <w:t>Criterios de aceptación</w:t>
             </w:r>
           </w:p>
         </w:tc>
@@ -2806,7 +2736,7 @@
                 <w:color w:val="172033"/>
                 <w:sz w:val="16"/>
               </w:rPr>
-              <w:t>Integración entre componentes y estado</w:t>
+              <w:t>Integración de estado y ubicación</w:t>
             </w:r>
           </w:p>
         </w:tc>
@@ -2838,7 +2768,7 @@
                 <w:color w:val="172033"/>
                 <w:sz w:val="16"/>
               </w:rPr>
-              <w:t>5. Preparación</w:t>
+              <w:t>5. Seguimiento</w:t>
             </w:r>
           </w:p>
         </w:tc>
@@ -2892,7 +2822,7 @@
                 <w:color w:val="172033"/>
                 <w:sz w:val="16"/>
               </w:rPr>
-              <w:t>Repertorio, recursos y checklists</w:t>
+              <w:t>Estados, historial y valoración</w:t>
             </w:r>
           </w:p>
         </w:tc>
@@ -2946,7 +2876,7 @@
                 <w:color w:val="172033"/>
                 <w:sz w:val="16"/>
               </w:rPr>
-              <w:t>Modelo contextual de servicio</w:t>
+              <w:t>Flujo principal operativo</w:t>
             </w:r>
           </w:p>
         </w:tc>
@@ -2973,7 +2903,7 @@
                 <w:color w:val="172033"/>
                 <w:sz w:val="16"/>
               </w:rPr>
-              <w:t>Gestión de archivos solo simulada</w:t>
+              <w:t>Notificaciones simuladas</w:t>
             </w:r>
           </w:p>
         </w:tc>
@@ -3118,7 +3048,7 @@
                 <w:color w:val="172033"/>
                 <w:sz w:val="16"/>
               </w:rPr>
-              <w:t>Seed determinista y estrategia de QA</w:t>
+              <w:t>Datos demo y checklist</w:t>
             </w:r>
           </w:p>
         </w:tc>
@@ -3146,7 +3076,7 @@
                 <w:color w:val="172033"/>
                 <w:sz w:val="16"/>
               </w:rPr>
-              <w:t>Tiempo limitado para corregir hallazgos</w:t>
+              <w:t>Tiempo de corrección limitado</w:t>
             </w:r>
           </w:p>
         </w:tc>
@@ -3232,7 +3162,7 @@
                 <w:color w:val="172033"/>
                 <w:sz w:val="16"/>
               </w:rPr>
-              <w:t>Sesiones con usuarios, resultados y presentación</w:t>
+              <w:t>Sesiones, resultados y presentación</w:t>
             </w:r>
           </w:p>
         </w:tc>
@@ -3286,7 +3216,7 @@
                 <w:color w:val="172033"/>
                 <w:sz w:val="16"/>
               </w:rPr>
-              <w:t>Acceso a voluntarios reales</w:t>
+              <w:t>Acceso a usuarios potenciales</w:t>
             </w:r>
           </w:p>
         </w:tc>
@@ -3336,7 +3266,7 @@
           <w:color w:val="172033"/>
           <w:sz w:val="22"/>
         </w:rPr>
-        <w:t>Recursos transversales: computadores personales, GitHub, entorno de desarrollo web, documentación del proyecto, datos demo, instrumentos de prueba y acceso programado a participantes. El calendario exacto se ajustará al cronograma oficial de la asignatura sin cambiar el orden de dependencias.</w:t>
+        <w:t>Recursos transversales: computadores personales, GitHub, entorno de desarrollo móvil, documentación del proyecto, datos de demostración e instrumentos de prueba. La elección final del stack y la distribución de backend, datos y calidad se acordarán entre los tres integrantes antes de comenzar la implementación.</w:t>
       </w:r>
     </w:p>
     <w:p>
@@ -3504,7 +3434,7 @@
                 <w:color w:val="172033"/>
                 <w:sz w:val="17"/>
               </w:rPr>
-              <w:t>Visión, requisitos, dominio, UX, arquitectura y decisiones</w:t>
+              <w:t>Problema, usuarios, requisitos, dominio, UX y decisiones</w:t>
             </w:r>
           </w:p>
         </w:tc>
@@ -3620,7 +3550,7 @@
                 <w:color w:val="172033"/>
                 <w:sz w:val="17"/>
               </w:rPr>
-              <w:t>Demuestra trabajo colaborativo, control de cambios y evolución del producto.</w:t>
+              <w:t>Demuestra colaboración, control de cambios y evolución del producto.</w:t>
             </w:r>
           </w:p>
         </w:tc>
@@ -3652,7 +3582,7 @@
                 <w:color w:val="172033"/>
                 <w:sz w:val="17"/>
               </w:rPr>
-              <w:t>Prototipo/MVP ejecutable</w:t>
+              <w:t>Prototipo/MVP móvil</w:t>
             </w:r>
           </w:p>
         </w:tc>
@@ -3679,7 +3609,7 @@
                 <w:color w:val="172033"/>
                 <w:sz w:val="17"/>
               </w:rPr>
-              <w:t>Flujo vertical persistente y responsive</w:t>
+              <w:t>Flujo de búsqueda y solicitud ejecutable</w:t>
             </w:r>
           </w:p>
         </w:tc>
@@ -3706,7 +3636,7 @@
                 <w:color w:val="172033"/>
                 <w:sz w:val="17"/>
               </w:rPr>
-              <w:t>Evidencia la integración de componentes y el cumplimiento funcional.</w:t>
+              <w:t>Evidencia integración de componentes y cumplimiento funcional.</w:t>
             </w:r>
           </w:p>
         </w:tc>
@@ -3795,7 +3725,7 @@
                 <w:color w:val="172033"/>
                 <w:sz w:val="17"/>
               </w:rPr>
-              <w:t>Permite controlar el avance y justificar decisiones de alcance.</w:t>
+              <w:t>Permite controlar avance y justificar decisiones de alcance.</w:t>
             </w:r>
           </w:p>
         </w:tc>
@@ -3881,7 +3811,7 @@
                 <w:color w:val="172033"/>
                 <w:sz w:val="17"/>
               </w:rPr>
-              <w:t>Demuestra validación del producto y mejoras basadas en resultados.</w:t>
+              <w:t>Demuestra verificación y mejoras basadas en resultados.</w:t>
             </w:r>
           </w:p>
         </w:tc>
@@ -3942,7 +3872,7 @@
                 <w:color w:val="172033"/>
                 <w:sz w:val="17"/>
               </w:rPr>
-              <w:t>Tareas, tiempos, éxito, dudas y comentarios de usuarios</w:t>
+              <w:t>Tareas, tiempos, éxito, dudas y comentarios</w:t>
             </w:r>
           </w:p>
         </w:tc>
@@ -3970,7 +3900,7 @@
                 <w:color w:val="172033"/>
                 <w:sz w:val="17"/>
               </w:rPr>
-              <w:t>Permite contrastar la propuesta de valor con personas representativas.</w:t>
+              <w:t>Contrasta la propuesta con clientes y profesionales potenciales.</w:t>
             </w:r>
           </w:p>
         </w:tc>
@@ -4056,7 +3986,7 @@
                 <w:color w:val="172033"/>
                 <w:sz w:val="17"/>
               </w:rPr>
-              <w:t>Comunica de forma verificable el resultado y el aprendizaje del proyecto.</w:t>
+              <w:t>Comunica de forma verificable el resultado y el aprendizaje.</w:t>
             </w:r>
           </w:p>
         </w:tc>
@@ -4087,7 +4017,7 @@
           <w:color w:val="172033"/>
           <w:sz w:val="22"/>
         </w:rPr>
-        <w:t>La definición incorpora los indicadores 1.1, 1.3, 2.1, 2.2, 3.1, 3.2, 4.1, 4.2 y 4.3. En esta fase se evidencia principalmente el diseño de pruebas, la planificación, el modelo escalable y la arquitectura de integración. La aplicación, el control y la implantación se demostrarán progresivamente mediante el repositorio, el MVP y los reportes de validación.</w:t>
+        <w:t>La definición incorpora los indicadores 1.1, 1.3, 2.1, 2.2, 3.1, 3.2, 4.1, 4.2 y 4.3. En esta fase se evidencia principalmente el diseño de pruebas, la planificación, el modelo escalable y la arquitectura de integración. La implementación, el control y la validación se demostrarán progresivamente mediante GitHub, el MVP y los reportes del equipo.</w:t>
       </w:r>
     </w:p>
     <w:p>
@@ -4102,7 +4032,7 @@
           <w:color w:val="172033"/>
           <w:sz w:val="22"/>
         </w:rPr>
-        <w:t>Pruebas: estrategia de dominio, componentes, recorridos end-to-end y verificación manual (RUAHTONE, 2026f).</w:t>
+        <w:t>Pruebas: estrategia para búsqueda, perfiles, creación de solicitudes, respuesta, estados y manejo de errores.</w:t>
       </w:r>
     </w:p>
     <w:p>
@@ -4117,7 +4047,7 @@
           <w:color w:val="172033"/>
           <w:sz w:val="22"/>
         </w:rPr>
-        <w:t>Gestión: roadmap por incrementos, definición de terminado, GitHub y seguimiento de riesgos (RUAHTONE, 2026e).</w:t>
+        <w:t>Gestión: roadmap incremental, backlog, definición de terminado, GitHub y seguimiento de riesgos.</w:t>
       </w:r>
     </w:p>
     <w:p>
@@ -4132,7 +4062,7 @@
           <w:color w:val="172033"/>
           <w:sz w:val="22"/>
         </w:rPr>
-        <w:t>Datos: entidades normalizadas, relaciones contextuales, invariantes y separación futura por iglesia (RUAHTONE, 2026c).</w:t>
+        <w:t>Datos: usuarios, profesionales, categorías, cobertura, solicitudes, estados y valoraciones con relaciones coherentes.</w:t>
       </w:r>
     </w:p>
     <w:p>
@@ -4147,7 +4077,7 @@
           <w:color w:val="172033"/>
           <w:sz w:val="22"/>
         </w:rPr>
-        <w:t>Desarrollo: capas UI, aplicación, dominio e infraestructura, integradas mediante acciones y repositorios (RUAHTONE, 2026d).</w:t>
+        <w:t>Desarrollo: frontend móvil, lógica de aplicación, dominio e infraestructura integrados mediante interfaces y servicios definidos.</w:t>
       </w:r>
     </w:p>
     <w:p>
@@ -4463,7 +4393,7 @@
                 <w:color w:val="172033"/>
                 <w:sz w:val="17"/>
               </w:rPr>
-              <w:t>Se explica el problema, la solución, el mercado inicial y su relación con el desarrollo de software.</w:t>
+              <w:t>Se explica el problema, la solución móvil, los usuarios iniciales y su relación con el desarrollo de software.</w:t>
             </w:r>
           </w:p>
         </w:tc>
@@ -4580,7 +4510,7 @@
                 <w:color w:val="172033"/>
                 <w:sz w:val="17"/>
               </w:rPr>
-              <w:t>Se relacionan pruebas, gestión, datos y desarrollo con actividades concretas del proyecto.</w:t>
+              <w:t>Se relacionan pruebas, gestión, datos y desarrollo con actividades concretas de Fix &amp; Go.</w:t>
             </w:r>
           </w:p>
         </w:tc>
@@ -4693,7 +4623,7 @@
                 <w:color w:val="172033"/>
                 <w:sz w:val="17"/>
               </w:rPr>
-              <w:t>Se explicitan intereses personales, experiencia e influencia en el aporte individual.</w:t>
+              <w:t>Se explicitan intereses de emprendimiento, fortalezas y aporte individual en frontend.</w:t>
             </w:r>
           </w:p>
         </w:tc>
@@ -4810,7 +4740,7 @@
                 <w:color w:val="172033"/>
                 <w:sz w:val="17"/>
               </w:rPr>
-              <w:t>Se delimitan tiempo, materiales, factores externos, riesgos y medidas de mitigación.</w:t>
+              <w:t>Se delimitan tiempo, recursos, dependencias, riesgos técnicos, privacidad y medidas de respuesta.</w:t>
             </w:r>
           </w:p>
         </w:tc>
@@ -5153,7 +5083,7 @@
                 <w:color w:val="172033"/>
                 <w:sz w:val="17"/>
               </w:rPr>
-              <w:t>El plan contiene actividades, duración, responsables, recursos, facilitadores y obstaculizadores.</w:t>
+              <w:t>El plan contiene actividades, duración, responsables provisionales, facilitadores y obstáculos.</w:t>
             </w:r>
           </w:p>
         </w:tc>
@@ -5270,7 +5200,7 @@
                 <w:color w:val="172033"/>
                 <w:sz w:val="17"/>
               </w:rPr>
-              <w:t>Cada evidencia se vincula con el logro de actividades y resultados del proyecto.</w:t>
+              <w:t>Cada evidencia se vincula con actividades y resultados esperados del proyecto.</w:t>
             </w:r>
           </w:p>
         </w:tc>
@@ -5383,7 +5313,7 @@
                 <w:color w:val="172033"/>
                 <w:sz w:val="17"/>
               </w:rPr>
-              <w:t>El informe fue revisado y utiliza referencias internas en formato APA 7 adaptado a documentos del proyecto.</w:t>
+              <w:t>El informe utiliza referencias académicas y una redacción formal y coherente.</w:t>
             </w:r>
           </w:p>
         </w:tc>
@@ -5500,7 +5430,7 @@
                 <w:color w:val="172033"/>
                 <w:sz w:val="17"/>
               </w:rPr>
-              <w:t>Incluye identificación, abstracts, desarrollo, conclusiones, reflexión, matriz y referencias.</w:t>
+              <w:t>Incluye identificación, abstracts, desarrollo, conclusión, reflexión, matrices y referencias.</w:t>
             </w:r>
           </w:p>
         </w:tc>
@@ -5730,7 +5660,7 @@
                 <w:color w:val="172033"/>
                 <w:sz w:val="17"/>
               </w:rPr>
-              <w:t>Abstract, conclusion and reflection use connected ideas and topic-specific vocabulary.</w:t>
+              <w:t>Abstract, conclusion and reflection communicate connected, project-specific ideas in English.</w:t>
             </w:r>
           </w:p>
         </w:tc>
@@ -5761,7 +5691,7 @@
           <w:color w:val="172033"/>
           <w:sz w:val="22"/>
         </w:rPr>
-        <w:t>RUAHTONE is a relevant and feasible Capstone project because it addresses a recurring coordination problem with a clearly bounded local MVP. The current proposal connects user needs with project management, data modeling, software development, and validation practices. Its strongest point is the service-centered model, which keeps assignments, songs, resources, checklists, and activity in one coherent operational space. The next stage must transform the approved specifications into a tested vertical prototype and collect evidence from real church volunteers.</w:t>
+        <w:t>Fix &amp; Go is a relevant and feasible Capstone project because it addresses a common local-services problem through a clearly bounded mobile MVP. The proposal connects user needs with project management, data modeling, software development, privacy, and validation practices. Its strongest point is the end-to-end flow from discovering a nearby professional to creating and tracking a service request. The next stage must validate the assumptions with clients and professionals, agree on the team responsibilities, select the technical stack, and transform the specification into a tested prototype.</w:t>
       </w:r>
     </w:p>
     <w:p>
@@ -5784,13 +5714,11 @@
           <w:color w:val="172033"/>
           <w:sz w:val="22"/>
         </w:rPr>
-        <w:t>This self-assessment helped me separate the long-term business vision from the product that we can responsibly build during the course. My practical experience in sound and worship is valuable, but it must be translated into explicit requirements, acceptance criteria, and testable decisions. I also identified that our technical ambition can become a risk if we expand the scope too early. I will contribute by protecting the agreed scope, documenting domain rules, coordinating evidence, and validating the sound and worship workflows with real users.</w:t>
+        <w:t>This self-assessment connected my strengths in software development, creativity, teamwork, project management, and English with my goal of becoming a technology founder. Fix &amp; Go lets me begin with frontend development while learning to manage scope and coordinate a growing product. I must strengthen architecture, automated testing, and security. In the next phase, I will lead the mobile interface, document decisions, and help define responsibilities with Daniel and Felipe.</w:t>
       </w:r>
     </w:p>
     <w:p>
-      <w:r>
-        <w:br w:type="page"/>
-      </w:r>
+      <w:r/>
     </w:p>
     <w:p>
       <w:pPr>
@@ -5814,7 +5742,7 @@
           <w:color w:val="172033"/>
           <w:sz w:val="18"/>
         </w:rPr>
-        <w:t>RUAHTONE. (2026a). Visión y alcance [Documento interno]. Repositorio RUAHTONE.</w:t>
+        <w:t>Duoc UC. (s.f.). Descripción del perfil de egreso: Ingeniería en Informática [Documento académico].</w:t>
       </w:r>
     </w:p>
     <w:p>
@@ -5830,7 +5758,7 @@
           <w:color w:val="172033"/>
           <w:sz w:val="18"/>
         </w:rPr>
-        <w:t>RUAHTONE. (2026b). Requisitos del producto [Documento interno]. Repositorio RUAHTONE.</w:t>
+        <w:t>Fix &amp; Go. (2026). Definición inicial del Proyecto APT [Documento de trabajo no publicado].</w:t>
       </w:r>
     </w:p>
     <w:p>
@@ -5846,7 +5774,7 @@
           <w:color w:val="172033"/>
           <w:sz w:val="18"/>
         </w:rPr>
-        <w:t>RUAHTONE. (2026c). Modelo de dominio [Documento interno]. Repositorio RUAHTONE.</w:t>
+        <w:t>Schwaber, K., &amp; Sutherland, J. (2020). The Scrum Guide. Scrum Guides.</w:t>
       </w:r>
     </w:p>
     <w:p>
@@ -5862,7 +5790,6 @@
           <w:color w:val="172033"/>
           <w:sz w:val="18"/>
         </w:rPr>
-        <w:t>RUAHTONE. (2026d). Arquitectura técnica [Documento interno]. Repositorio RUAHTONE.</w:t>
       </w:r>
     </w:p>
     <w:p>
@@ -5878,7 +5805,6 @@
           <w:color w:val="172033"/>
           <w:sz w:val="18"/>
         </w:rPr>
-        <w:t>RUAHTONE. (2026e). Roadmap del MVP [Documento interno]. Repositorio RUAHTONE.</w:t>
       </w:r>
     </w:p>
     <w:p>
@@ -5894,7 +5820,6 @@
           <w:color w:val="172033"/>
           <w:sz w:val="18"/>
         </w:rPr>
-        <w:t>RUAHTONE. (2026f). Estrategia de calidad [Documento interno]. Repositorio RUAHTONE.</w:t>
       </w:r>
     </w:p>
     <w:sectPr>
@@ -5922,7 +5847,7 @@
         <w:color w:val="667085"/>
         <w:sz w:val="17"/>
       </w:rPr>
-      <w:t>Benjamín Olmedo  •  PTY4614  •  Sección 005D</w:t>
+      <w:t>Benjamín Olmedo  •  APT122  •  Sección 005D</w:t>
     </w:r>
     <w:r>
       <w:rPr>
@@ -5958,7 +5883,7 @@
         <w:color w:val="667085"/>
         <w:sz w:val="17"/>
       </w:rPr>
-      <w:t>RUAHTONE  /  AUTOEVALUACIÓN DEFINICIÓN PROYECTO APT</w:t>
+      <w:t>FIX &amp; GO  /  AUTOEVALUACIÓN DEFINICIÓN PROYECTO APT</w:t>
     </w:r>
   </w:p>
 </w:hdr>

</xml_diff>